<commit_message>
docs: fix version history — restore 0.1–0.4 from original doc, add 0.5
Co-Authored-By: Claude Sonnet 4.6 <noreply@anthropic.com>
</commit_message>
<xml_diff>
--- a/docs/AMD-Compliance-Internal-Control.docx
+++ b/docs/AMD-Compliance-Internal-Control.docx
@@ -5490,7 +5490,7 @@
                 <w:sz w:val="20"/>
                 <w:szCs w:val="20"/>
               </w:rPr>
-              <w:t xml:space="preserve">Initial version</w:t>
+              <w:t xml:space="preserve">Initial draft</w:t>
             </w:r>
           </w:p>
         </w:tc>
@@ -5550,6 +5550,360 @@
                 <w:sz w:val="20"/>
                 <w:szCs w:val="20"/>
               </w:rPr>
+              <w:t xml:space="preserve">2026-06-09</w:t>
+            </w:r>
+          </w:p>
+        </w:tc>
+        <w:tc>
+          <w:tcPr>
+            <w:tcW w:type="dxa" w:w="2500"/>
+            <w:tcBorders>
+              <w:top w:val="single" w:color="CCCCCC" w:sz="1"/>
+              <w:left w:val="single" w:color="CCCCCC" w:sz="1"/>
+              <w:bottom w:val="single" w:color="CCCCCC" w:sz="1"/>
+              <w:right w:val="single" w:color="CCCCCC" w:sz="1"/>
+            </w:tcBorders>
+            <w:tcMar>
+              <w:top w:type="dxa" w:w="80"/>
+              <w:left w:type="dxa" w:w="120"/>
+              <w:bottom w:type="dxa" w:w="80"/>
+              <w:right w:type="dxa" w:w="120"/>
+            </w:tcMar>
+          </w:tcPr>
+          <w:p>
+            <w:r>
+              <w:rPr>
+                <w:rFonts w:ascii="Arial" w:cs="Arial" w:eastAsia="Arial" w:hAnsi="Arial"/>
+                <w:b w:val="false"/>
+                <w:bCs w:val="false"/>
+                <w:sz w:val="20"/>
+                <w:szCs w:val="20"/>
+              </w:rPr>
+              <w:t xml:space="preserve">Martin Moresco</w:t>
+            </w:r>
+          </w:p>
+        </w:tc>
+        <w:tc>
+          <w:tcPr>
+            <w:tcW w:type="dxa" w:w="3860"/>
+            <w:tcBorders>
+              <w:top w:val="single" w:color="CCCCCC" w:sz="1"/>
+              <w:left w:val="single" w:color="CCCCCC" w:sz="1"/>
+              <w:bottom w:val="single" w:color="CCCCCC" w:sz="1"/>
+              <w:right w:val="single" w:color="CCCCCC" w:sz="1"/>
+            </w:tcBorders>
+            <w:tcMar>
+              <w:top w:type="dxa" w:w="80"/>
+              <w:left w:type="dxa" w:w="120"/>
+              <w:bottom w:type="dxa" w:w="80"/>
+              <w:right w:type="dxa" w:w="120"/>
+            </w:tcMar>
+          </w:tcPr>
+          <w:p>
+            <w:r>
+              <w:rPr>
+                <w:rFonts w:ascii="Arial" w:cs="Arial" w:eastAsia="Arial" w:hAnsi="Arial"/>
+                <w:b w:val="false"/>
+                <w:bCs w:val="false"/>
+                <w:sz w:val="20"/>
+                <w:szCs w:val="20"/>
+              </w:rPr>
+              <w:t xml:space="preserve">Added Jira Initiative/Epic IDs, SOX multi-epic structure</w:t>
+            </w:r>
+          </w:p>
+        </w:tc>
+      </w:tr>
+      <w:tr>
+        <w:tc>
+          <w:tcPr>
+            <w:tcW w:type="dxa" w:w="1200"/>
+            <w:tcBorders>
+              <w:top w:val="single" w:color="CCCCCC" w:sz="1"/>
+              <w:left w:val="single" w:color="CCCCCC" w:sz="1"/>
+              <w:bottom w:val="single" w:color="CCCCCC" w:sz="1"/>
+              <w:right w:val="single" w:color="CCCCCC" w:sz="1"/>
+            </w:tcBorders>
+            <w:tcMar>
+              <w:top w:type="dxa" w:w="80"/>
+              <w:left w:type="dxa" w:w="120"/>
+              <w:bottom w:type="dxa" w:w="80"/>
+              <w:right w:type="dxa" w:w="120"/>
+            </w:tcMar>
+          </w:tcPr>
+          <w:p>
+            <w:r>
+              <w:rPr>
+                <w:rFonts w:ascii="Arial" w:cs="Arial" w:eastAsia="Arial" w:hAnsi="Arial"/>
+                <w:b w:val="false"/>
+                <w:bCs w:val="false"/>
+                <w:sz w:val="20"/>
+                <w:szCs w:val="20"/>
+              </w:rPr>
+              <w:t xml:space="preserve">0.3</w:t>
+            </w:r>
+          </w:p>
+        </w:tc>
+        <w:tc>
+          <w:tcPr>
+            <w:tcW w:type="dxa" w:w="1800"/>
+            <w:tcBorders>
+              <w:top w:val="single" w:color="CCCCCC" w:sz="1"/>
+              <w:left w:val="single" w:color="CCCCCC" w:sz="1"/>
+              <w:bottom w:val="single" w:color="CCCCCC" w:sz="1"/>
+              <w:right w:val="single" w:color="CCCCCC" w:sz="1"/>
+            </w:tcBorders>
+            <w:tcMar>
+              <w:top w:type="dxa" w:w="80"/>
+              <w:left w:type="dxa" w:w="120"/>
+              <w:bottom w:type="dxa" w:w="80"/>
+              <w:right w:type="dxa" w:w="120"/>
+            </w:tcMar>
+          </w:tcPr>
+          <w:p>
+            <w:r>
+              <w:rPr>
+                <w:rFonts w:ascii="Arial" w:cs="Arial" w:eastAsia="Arial" w:hAnsi="Arial"/>
+                <w:b w:val="false"/>
+                <w:bCs w:val="false"/>
+                <w:sz w:val="20"/>
+                <w:szCs w:val="20"/>
+              </w:rPr>
+              <w:t xml:space="preserve">2026-06-11</w:t>
+            </w:r>
+          </w:p>
+        </w:tc>
+        <w:tc>
+          <w:tcPr>
+            <w:tcW w:type="dxa" w:w="2500"/>
+            <w:tcBorders>
+              <w:top w:val="single" w:color="CCCCCC" w:sz="1"/>
+              <w:left w:val="single" w:color="CCCCCC" w:sz="1"/>
+              <w:bottom w:val="single" w:color="CCCCCC" w:sz="1"/>
+              <w:right w:val="single" w:color="CCCCCC" w:sz="1"/>
+            </w:tcBorders>
+            <w:tcMar>
+              <w:top w:type="dxa" w:w="80"/>
+              <w:left w:type="dxa" w:w="120"/>
+              <w:bottom w:type="dxa" w:w="80"/>
+              <w:right w:type="dxa" w:w="120"/>
+            </w:tcMar>
+          </w:tcPr>
+          <w:p>
+            <w:r>
+              <w:rPr>
+                <w:rFonts w:ascii="Arial" w:cs="Arial" w:eastAsia="Arial" w:hAnsi="Arial"/>
+                <w:b w:val="false"/>
+                <w:bCs w:val="false"/>
+                <w:sz w:val="20"/>
+                <w:szCs w:val="20"/>
+              </w:rPr>
+              <w:t xml:space="preserve">Martin Moresco</w:t>
+            </w:r>
+          </w:p>
+        </w:tc>
+        <w:tc>
+          <w:tcPr>
+            <w:tcW w:type="dxa" w:w="3860"/>
+            <w:tcBorders>
+              <w:top w:val="single" w:color="CCCCCC" w:sz="1"/>
+              <w:left w:val="single" w:color="CCCCCC" w:sz="1"/>
+              <w:bottom w:val="single" w:color="CCCCCC" w:sz="1"/>
+              <w:right w:val="single" w:color="CCCCCC" w:sz="1"/>
+            </w:tcBorders>
+            <w:tcMar>
+              <w:top w:type="dxa" w:w="80"/>
+              <w:left w:type="dxa" w:w="120"/>
+              <w:bottom w:type="dxa" w:w="80"/>
+              <w:right w:type="dxa" w:w="120"/>
+            </w:tcMar>
+          </w:tcPr>
+          <w:p>
+            <w:r>
+              <w:rPr>
+                <w:rFonts w:ascii="Arial" w:cs="Arial" w:eastAsia="Arial" w:hAnsi="Arial"/>
+                <w:b w:val="false"/>
+                <w:bCs w:val="false"/>
+                <w:sz w:val="20"/>
+                <w:szCs w:val="20"/>
+              </w:rPr>
+              <w:t xml:space="preserve">Unified Initiative root; manager role generalized; removed task naming prefixes</w:t>
+            </w:r>
+          </w:p>
+        </w:tc>
+      </w:tr>
+      <w:tr>
+        <w:tc>
+          <w:tcPr>
+            <w:tcW w:type="dxa" w:w="1200"/>
+            <w:tcBorders>
+              <w:top w:val="single" w:color="CCCCCC" w:sz="1"/>
+              <w:left w:val="single" w:color="CCCCCC" w:sz="1"/>
+              <w:bottom w:val="single" w:color="CCCCCC" w:sz="1"/>
+              <w:right w:val="single" w:color="CCCCCC" w:sz="1"/>
+            </w:tcBorders>
+            <w:tcMar>
+              <w:top w:type="dxa" w:w="80"/>
+              <w:left w:type="dxa" w:w="120"/>
+              <w:bottom w:type="dxa" w:w="80"/>
+              <w:right w:type="dxa" w:w="120"/>
+            </w:tcMar>
+          </w:tcPr>
+          <w:p>
+            <w:r>
+              <w:rPr>
+                <w:rFonts w:ascii="Arial" w:cs="Arial" w:eastAsia="Arial" w:hAnsi="Arial"/>
+                <w:b w:val="false"/>
+                <w:bCs w:val="false"/>
+                <w:sz w:val="20"/>
+                <w:szCs w:val="20"/>
+              </w:rPr>
+              <w:t xml:space="preserve">0.4</w:t>
+            </w:r>
+          </w:p>
+        </w:tc>
+        <w:tc>
+          <w:tcPr>
+            <w:tcW w:type="dxa" w:w="1800"/>
+            <w:tcBorders>
+              <w:top w:val="single" w:color="CCCCCC" w:sz="1"/>
+              <w:left w:val="single" w:color="CCCCCC" w:sz="1"/>
+              <w:bottom w:val="single" w:color="CCCCCC" w:sz="1"/>
+              <w:right w:val="single" w:color="CCCCCC" w:sz="1"/>
+            </w:tcBorders>
+            <w:tcMar>
+              <w:top w:type="dxa" w:w="80"/>
+              <w:left w:type="dxa" w:w="120"/>
+              <w:bottom w:type="dxa" w:w="80"/>
+              <w:right w:type="dxa" w:w="120"/>
+            </w:tcMar>
+          </w:tcPr>
+          <w:p>
+            <w:r>
+              <w:rPr>
+                <w:rFonts w:ascii="Arial" w:cs="Arial" w:eastAsia="Arial" w:hAnsi="Arial"/>
+                <w:b w:val="false"/>
+                <w:bCs w:val="false"/>
+                <w:sz w:val="20"/>
+                <w:szCs w:val="20"/>
+              </w:rPr>
+              <w:t xml:space="preserve">2026-06-17</w:t>
+            </w:r>
+          </w:p>
+        </w:tc>
+        <w:tc>
+          <w:tcPr>
+            <w:tcW w:type="dxa" w:w="2500"/>
+            <w:tcBorders>
+              <w:top w:val="single" w:color="CCCCCC" w:sz="1"/>
+              <w:left w:val="single" w:color="CCCCCC" w:sz="1"/>
+              <w:bottom w:val="single" w:color="CCCCCC" w:sz="1"/>
+              <w:right w:val="single" w:color="CCCCCC" w:sz="1"/>
+            </w:tcBorders>
+            <w:tcMar>
+              <w:top w:type="dxa" w:w="80"/>
+              <w:left w:type="dxa" w:w="120"/>
+              <w:bottom w:type="dxa" w:w="80"/>
+              <w:right w:type="dxa" w:w="120"/>
+            </w:tcMar>
+          </w:tcPr>
+          <w:p>
+            <w:r>
+              <w:rPr>
+                <w:rFonts w:ascii="Arial" w:cs="Arial" w:eastAsia="Arial" w:hAnsi="Arial"/>
+                <w:b w:val="false"/>
+                <w:bCs w:val="false"/>
+                <w:sz w:val="20"/>
+                <w:szCs w:val="20"/>
+              </w:rPr>
+              <w:t xml:space="preserve">Martin Moresco</w:t>
+            </w:r>
+          </w:p>
+        </w:tc>
+        <w:tc>
+          <w:tcPr>
+            <w:tcW w:type="dxa" w:w="3860"/>
+            <w:tcBorders>
+              <w:top w:val="single" w:color="CCCCCC" w:sz="1"/>
+              <w:left w:val="single" w:color="CCCCCC" w:sz="1"/>
+              <w:bottom w:val="single" w:color="CCCCCC" w:sz="1"/>
+              <w:right w:val="single" w:color="CCCCCC" w:sz="1"/>
+            </w:tcBorders>
+            <w:tcMar>
+              <w:top w:type="dxa" w:w="80"/>
+              <w:left w:type="dxa" w:w="120"/>
+              <w:bottom w:type="dxa" w:w="80"/>
+              <w:right w:type="dxa" w:w="120"/>
+            </w:tcMar>
+          </w:tcPr>
+          <w:p>
+            <w:r>
+              <w:rPr>
+                <w:rFonts w:ascii="Arial" w:cs="Arial" w:eastAsia="Arial" w:hAnsi="Arial"/>
+                <w:b w:val="false"/>
+                <w:bCs w:val="false"/>
+                <w:sz w:val="20"/>
+                <w:szCs w:val="20"/>
+              </w:rPr>
+              <w:t xml:space="preserve">Replaced GIST and Compliance sections with Internal Infrastructure (GBN980), External Infrastructure (GL1404), and SOX Infrastructure (GLO815X); tracking now based on label Offense-Discovered-Vuln per project</w:t>
+            </w:r>
+          </w:p>
+        </w:tc>
+      </w:tr>
+      <w:tr>
+        <w:tc>
+          <w:tcPr>
+            <w:tcW w:type="dxa" w:w="1200"/>
+            <w:tcBorders>
+              <w:top w:val="single" w:color="CCCCCC" w:sz="1"/>
+              <w:left w:val="single" w:color="CCCCCC" w:sz="1"/>
+              <w:bottom w:val="single" w:color="CCCCCC" w:sz="1"/>
+              <w:right w:val="single" w:color="CCCCCC" w:sz="1"/>
+            </w:tcBorders>
+            <w:tcMar>
+              <w:top w:type="dxa" w:w="80"/>
+              <w:left w:type="dxa" w:w="120"/>
+              <w:bottom w:type="dxa" w:w="80"/>
+              <w:right w:type="dxa" w:w="120"/>
+            </w:tcMar>
+          </w:tcPr>
+          <w:p>
+            <w:r>
+              <w:rPr>
+                <w:rFonts w:ascii="Arial" w:cs="Arial" w:eastAsia="Arial" w:hAnsi="Arial"/>
+                <w:b w:val="false"/>
+                <w:bCs w:val="false"/>
+                <w:sz w:val="20"/>
+                <w:szCs w:val="20"/>
+              </w:rPr>
+              <w:t xml:space="preserve">0.5</w:t>
+            </w:r>
+          </w:p>
+        </w:tc>
+        <w:tc>
+          <w:tcPr>
+            <w:tcW w:type="dxa" w:w="1800"/>
+            <w:tcBorders>
+              <w:top w:val="single" w:color="CCCCCC" w:sz="1"/>
+              <w:left w:val="single" w:color="CCCCCC" w:sz="1"/>
+              <w:bottom w:val="single" w:color="CCCCCC" w:sz="1"/>
+              <w:right w:val="single" w:color="CCCCCC" w:sz="1"/>
+            </w:tcBorders>
+            <w:tcMar>
+              <w:top w:type="dxa" w:w="80"/>
+              <w:left w:type="dxa" w:w="120"/>
+              <w:bottom w:type="dxa" w:w="80"/>
+              <w:right w:type="dxa" w:w="120"/>
+            </w:tcMar>
+          </w:tcPr>
+          <w:p>
+            <w:r>
+              <w:rPr>
+                <w:rFonts w:ascii="Arial" w:cs="Arial" w:eastAsia="Arial" w:hAnsi="Arial"/>
+                <w:b w:val="false"/>
+                <w:bCs w:val="false"/>
+                <w:sz w:val="20"/>
+                <w:szCs w:val="20"/>
+              </w:rPr>
               <w:t xml:space="preserve">2026-06-22</w:t>
             </w:r>
           </w:p>
@@ -5608,7 +5962,7 @@
                 <w:sz w:val="20"/>
                 <w:szCs w:val="20"/>
               </w:rPr>
-              <w:t xml:space="preserve">Updated SOX hierarchy (GLO220-11373, Tasks GLO220-11377/11383/11384/11385), Vulnerability issue type for infrastructure tabs, External-Pentest label for External Infrastructure, severity field replacing priority</w:t>
+              <w:t xml:space="preserve">Updated SOX hierarchy to Initiative (GLO220-11373) -&gt; Task -&gt; Sub-task with tasks GLO220-11377 (SAP), GLO220-11383 (AWS), GLO220-11384 (GLOW), GLO220-11385 (SSFF); issue type changed to Vulnerability for infrastructure tabs; External-Pentest label added for External Infrastructure; severity field replaces priority; Other sub-tab captures tasks and subtasks not mapped to the 4 known systems</w:t>
             </w:r>
           </w:p>
         </w:tc>

</xml_diff>

<commit_message>
fix: update Jira base URL to globant-services.atlassian.net
- Add JIRA_BROWSE_URL constant to constants.js
- compliance-view.js and sox-report.js import and use the constant
- docs: bump to v0.6 with URL change

Co-Authored-By: Claude Sonnet 4.6 <noreply@anthropic.com>
</commit_message>
<xml_diff>
--- a/docs/AMD-Compliance-Internal-Control.docx
+++ b/docs/AMD-Compliance-Internal-Control.docx
@@ -5963,6 +5963,124 @@
                 <w:szCs w:val="20"/>
               </w:rPr>
               <w:t xml:space="preserve">Updated SOX hierarchy to Initiative (GLO220-11373) -&gt; Task -&gt; Sub-task with tasks GLO220-11377 (SAP), GLO220-11383 (AWS), GLO220-11384 (GLOW), GLO220-11385 (SSFF); issue type changed to Vulnerability for infrastructure tabs; External-Pentest label added for External Infrastructure; severity field replaces priority; Other sub-tab captures tasks and subtasks not mapped to the 4 known systems</w:t>
+            </w:r>
+          </w:p>
+        </w:tc>
+      </w:tr>
+      <w:tr>
+        <w:tc>
+          <w:tcPr>
+            <w:tcW w:type="dxa" w:w="1200"/>
+            <w:tcBorders>
+              <w:top w:val="single" w:color="CCCCCC" w:sz="1"/>
+              <w:left w:val="single" w:color="CCCCCC" w:sz="1"/>
+              <w:bottom w:val="single" w:color="CCCCCC" w:sz="1"/>
+              <w:right w:val="single" w:color="CCCCCC" w:sz="1"/>
+            </w:tcBorders>
+            <w:tcMar>
+              <w:top w:type="dxa" w:w="80"/>
+              <w:left w:type="dxa" w:w="120"/>
+              <w:bottom w:type="dxa" w:w="80"/>
+              <w:right w:type="dxa" w:w="120"/>
+            </w:tcMar>
+          </w:tcPr>
+          <w:p>
+            <w:r>
+              <w:rPr>
+                <w:rFonts w:ascii="Arial" w:cs="Arial" w:eastAsia="Arial" w:hAnsi="Arial"/>
+                <w:b w:val="false"/>
+                <w:bCs w:val="false"/>
+                <w:sz w:val="20"/>
+                <w:szCs w:val="20"/>
+              </w:rPr>
+              <w:t xml:space="preserve">0.6</w:t>
+            </w:r>
+          </w:p>
+        </w:tc>
+        <w:tc>
+          <w:tcPr>
+            <w:tcW w:type="dxa" w:w="1800"/>
+            <w:tcBorders>
+              <w:top w:val="single" w:color="CCCCCC" w:sz="1"/>
+              <w:left w:val="single" w:color="CCCCCC" w:sz="1"/>
+              <w:bottom w:val="single" w:color="CCCCCC" w:sz="1"/>
+              <w:right w:val="single" w:color="CCCCCC" w:sz="1"/>
+            </w:tcBorders>
+            <w:tcMar>
+              <w:top w:type="dxa" w:w="80"/>
+              <w:left w:type="dxa" w:w="120"/>
+              <w:bottom w:type="dxa" w:w="80"/>
+              <w:right w:type="dxa" w:w="120"/>
+            </w:tcMar>
+          </w:tcPr>
+          <w:p>
+            <w:r>
+              <w:rPr>
+                <w:rFonts w:ascii="Arial" w:cs="Arial" w:eastAsia="Arial" w:hAnsi="Arial"/>
+                <w:b w:val="false"/>
+                <w:bCs w:val="false"/>
+                <w:sz w:val="20"/>
+                <w:szCs w:val="20"/>
+              </w:rPr>
+              <w:t xml:space="preserve">2026-06-23</w:t>
+            </w:r>
+          </w:p>
+        </w:tc>
+        <w:tc>
+          <w:tcPr>
+            <w:tcW w:type="dxa" w:w="2500"/>
+            <w:tcBorders>
+              <w:top w:val="single" w:color="CCCCCC" w:sz="1"/>
+              <w:left w:val="single" w:color="CCCCCC" w:sz="1"/>
+              <w:bottom w:val="single" w:color="CCCCCC" w:sz="1"/>
+              <w:right w:val="single" w:color="CCCCCC" w:sz="1"/>
+            </w:tcBorders>
+            <w:tcMar>
+              <w:top w:type="dxa" w:w="80"/>
+              <w:left w:type="dxa" w:w="120"/>
+              <w:bottom w:type="dxa" w:w="80"/>
+              <w:right w:type="dxa" w:w="120"/>
+            </w:tcMar>
+          </w:tcPr>
+          <w:p>
+            <w:r>
+              <w:rPr>
+                <w:rFonts w:ascii="Arial" w:cs="Arial" w:eastAsia="Arial" w:hAnsi="Arial"/>
+                <w:b w:val="false"/>
+                <w:bCs w:val="false"/>
+                <w:sz w:val="20"/>
+                <w:szCs w:val="20"/>
+              </w:rPr>
+              <w:t xml:space="preserve">Martin Moresco</w:t>
+            </w:r>
+          </w:p>
+        </w:tc>
+        <w:tc>
+          <w:tcPr>
+            <w:tcW w:type="dxa" w:w="3860"/>
+            <w:tcBorders>
+              <w:top w:val="single" w:color="CCCCCC" w:sz="1"/>
+              <w:left w:val="single" w:color="CCCCCC" w:sz="1"/>
+              <w:bottom w:val="single" w:color="CCCCCC" w:sz="1"/>
+              <w:right w:val="single" w:color="CCCCCC" w:sz="1"/>
+            </w:tcBorders>
+            <w:tcMar>
+              <w:top w:type="dxa" w:w="80"/>
+              <w:left w:type="dxa" w:w="120"/>
+              <w:bottom w:type="dxa" w:w="80"/>
+              <w:right w:type="dxa" w:w="120"/>
+            </w:tcMar>
+          </w:tcPr>
+          <w:p>
+            <w:r>
+              <w:rPr>
+                <w:rFonts w:ascii="Arial" w:cs="Arial" w:eastAsia="Arial" w:hAnsi="Arial"/>
+                <w:b w:val="false"/>
+                <w:bCs w:val="false"/>
+                <w:sz w:val="20"/>
+                <w:szCs w:val="20"/>
+              </w:rPr>
+              <w:t xml:space="preserve">Updated Jira base URL to globant-services.atlassian.net</w:t>
             </w:r>
           </w:p>
         </w:tc>

</xml_diff>